<commit_message>
Docs: Sprint Retrospectives 3 & 4, Project Plan
</commit_message>
<xml_diff>
--- a/documentation/Sprint Retrospective2-5.docx
+++ b/documentation/Sprint Retrospective2-5.docx
@@ -30,32 +30,50 @@
           <w:sz w:val="32"/>
           <w:szCs w:val="32"/>
         </w:rPr>
-        <w:t>2</w:t>
-      </w:r>
+        <w:t>3</w:t>
+      </w:r>
+    </w:p>
+    <w:p>
+      <w:pPr>
+        <w:rPr>
+          <w:rFonts w:ascii="Cascadia Mono" w:hAnsi="Cascadia Mono"/>
+        </w:rPr>
+      </w:pPr>
       <w:r>
         <w:rPr>
           <w:rFonts w:ascii="Cascadia Mono" w:hAnsi="Cascadia Mono"/>
           <w:b/>
           <w:bCs/>
-          <w:sz w:val="32"/>
-          <w:szCs w:val="32"/>
-        </w:rPr>
-        <w:t>.5</w:t>
-      </w:r>
-    </w:p>
-    <w:p>
-      <w:pPr>
-        <w:rPr>
-          <w:rFonts w:ascii="Cascadia Mono" w:hAnsi="Cascadia Mono"/>
-        </w:rPr>
-      </w:pPr>
+        </w:rPr>
+        <w:t>Project name:</w:t>
+      </w:r>
+      <w:r>
+        <w:rPr>
+          <w:rFonts w:ascii="Cascadia Mono" w:hAnsi="Cascadia Mono"/>
+        </w:rPr>
+        <w:t xml:space="preserve"> </w:t>
+      </w:r>
+      <w:proofErr w:type="spellStart"/>
+      <w:r>
+        <w:rPr>
+          <w:rFonts w:ascii="Cascadia Mono" w:hAnsi="Cascadia Mono"/>
+        </w:rPr>
+        <w:t>NightOwls</w:t>
+      </w:r>
+      <w:proofErr w:type="spellEnd"/>
+      <w:r>
+        <w:rPr>
+          <w:rFonts w:ascii="Cascadia Mono" w:hAnsi="Cascadia Mono"/>
+        </w:rPr>
+        <w:br/>
+      </w:r>
       <w:r>
         <w:rPr>
           <w:rFonts w:ascii="Cascadia Mono" w:hAnsi="Cascadia Mono"/>
           <w:b/>
           <w:bCs/>
         </w:rPr>
-        <w:t>Project name:</w:t>
+        <w:t>Sprint:</w:t>
       </w:r>
       <w:r>
         <w:rPr>
@@ -63,14 +81,12 @@
         </w:rPr>
         <w:t xml:space="preserve"> </w:t>
       </w:r>
-      <w:proofErr w:type="spellStart"/>
-      <w:r>
-        <w:rPr>
-          <w:rFonts w:ascii="Cascadia Mono" w:hAnsi="Cascadia Mono"/>
-        </w:rPr>
-        <w:t>NightOwls</w:t>
-      </w:r>
-      <w:proofErr w:type="spellEnd"/>
+      <w:r>
+        <w:rPr>
+          <w:rFonts w:ascii="Cascadia Mono" w:hAnsi="Cascadia Mono"/>
+        </w:rPr>
+        <w:t>3</w:t>
+      </w:r>
       <w:r>
         <w:rPr>
           <w:rFonts w:ascii="Cascadia Mono" w:hAnsi="Cascadia Mono"/>
@@ -83,25 +99,32 @@
           <w:b/>
           <w:bCs/>
         </w:rPr>
-        <w:t>Sprint:</w:t>
-      </w:r>
-      <w:r>
-        <w:rPr>
-          <w:rFonts w:ascii="Cascadia Mono" w:hAnsi="Cascadia Mono"/>
-        </w:rPr>
-        <w:t xml:space="preserve"> </w:t>
-      </w:r>
-      <w:r>
-        <w:rPr>
-          <w:rFonts w:ascii="Cascadia Mono" w:hAnsi="Cascadia Mono"/>
-        </w:rPr>
-        <w:t>2</w:t>
-      </w:r>
-      <w:r>
-        <w:rPr>
-          <w:rFonts w:ascii="Cascadia Mono" w:hAnsi="Cascadia Mono"/>
-        </w:rPr>
-        <w:t>.5</w:t>
+        <w:t>Sprint retrospective held:</w:t>
+      </w:r>
+      <w:r>
+        <w:rPr>
+          <w:rFonts w:ascii="Cascadia Mono" w:hAnsi="Cascadia Mono"/>
+        </w:rPr>
+        <w:t xml:space="preserve"> December </w:t>
+      </w:r>
+      <w:r>
+        <w:rPr>
+          <w:rFonts w:ascii="Cascadia Mono" w:hAnsi="Cascadia Mono"/>
+        </w:rPr>
+        <w:t>30</w:t>
+      </w:r>
+      <w:r>
+        <w:rPr>
+          <w:rFonts w:ascii="Cascadia Mono" w:hAnsi="Cascadia Mono"/>
+          <w:vertAlign w:val="superscript"/>
+        </w:rPr>
+        <w:t>th</w:t>
+      </w:r>
+      <w:r>
+        <w:rPr>
+          <w:rFonts w:ascii="Cascadia Mono" w:hAnsi="Cascadia Mono"/>
+        </w:rPr>
+        <w:t xml:space="preserve"> 2025, 6PM </w:t>
       </w:r>
       <w:r>
         <w:rPr>
@@ -115,7 +138,7 @@
           <w:b/>
           <w:bCs/>
         </w:rPr>
-        <w:t>Sprint retrospective held:</w:t>
+        <w:t>Duration:</w:t>
       </w:r>
       <w:r>
         <w:rPr>
@@ -140,58 +163,19 @@
         <w:rPr>
           <w:rFonts w:ascii="Cascadia Mono" w:hAnsi="Cascadia Mono"/>
         </w:rPr>
-        <w:t xml:space="preserve"> 2025, 6PM </w:t>
-      </w:r>
-      <w:r>
-        <w:rPr>
-          <w:rFonts w:ascii="Cascadia Mono" w:hAnsi="Cascadia Mono"/>
-        </w:rPr>
-        <w:br/>
-      </w:r>
-      <w:r>
-        <w:rPr>
-          <w:rFonts w:ascii="Cascadia Mono" w:hAnsi="Cascadia Mono"/>
-          <w:b/>
-          <w:bCs/>
-        </w:rPr>
-        <w:t>Duration:</w:t>
-      </w:r>
-      <w:r>
-        <w:rPr>
-          <w:rFonts w:ascii="Cascadia Mono" w:hAnsi="Cascadia Mono"/>
-        </w:rPr>
-        <w:t xml:space="preserve"> December </w:t>
-      </w:r>
-      <w:r>
-        <w:rPr>
-          <w:rFonts w:ascii="Cascadia Mono" w:hAnsi="Cascadia Mono"/>
-        </w:rPr>
-        <w:t>1</w:t>
+        <w:t xml:space="preserve"> 2025 – December </w:t>
+      </w:r>
+      <w:r>
+        <w:rPr>
+          <w:rFonts w:ascii="Cascadia Mono" w:hAnsi="Cascadia Mono"/>
+        </w:rPr>
+        <w:t>2</w:t>
       </w:r>
       <w:r>
         <w:rPr>
           <w:rFonts w:ascii="Cascadia Mono" w:hAnsi="Cascadia Mono"/>
         </w:rPr>
         <w:t>9</w:t>
-      </w:r>
-      <w:r>
-        <w:rPr>
-          <w:rFonts w:ascii="Cascadia Mono" w:hAnsi="Cascadia Mono"/>
-          <w:vertAlign w:val="superscript"/>
-        </w:rPr>
-        <w:t>th</w:t>
-      </w:r>
-      <w:r>
-        <w:rPr>
-          <w:rFonts w:ascii="Cascadia Mono" w:hAnsi="Cascadia Mono"/>
-        </w:rPr>
-        <w:t xml:space="preserve"> 2025 – December </w:t>
-      </w:r>
-      <w:r>
-        <w:rPr>
-          <w:rFonts w:ascii="Cascadia Mono" w:hAnsi="Cascadia Mono"/>
-        </w:rPr>
-        <w:t>23</w:t>
       </w:r>
       <w:r>
         <w:rPr>
@@ -305,7 +289,7 @@
         <w:rPr>
           <w:rFonts w:ascii="Cascadia Mono" w:hAnsi="Cascadia Mono"/>
         </w:rPr>
-        <w:t>Connect the project repository to Git</w:t>
+        <w:t>Complete all required tasks for ISS Checkpoint 1.</w:t>
       </w:r>
     </w:p>
     <w:p>
@@ -322,13 +306,7 @@
         <w:rPr>
           <w:rFonts w:ascii="Cascadia Mono" w:hAnsi="Cascadia Mono"/>
         </w:rPr>
-        <w:t>Finalize</w:t>
-      </w:r>
-      <w:r>
-        <w:rPr>
-          <w:rFonts w:ascii="Cascadia Mono" w:hAnsi="Cascadia Mono"/>
-        </w:rPr>
-        <w:t xml:space="preserve"> entity classes and enumerations</w:t>
+        <w:t>Improve and update the Trello board, including linking relevant Git commits.</w:t>
       </w:r>
     </w:p>
     <w:p>
@@ -345,77 +323,7 @@
         <w:rPr>
           <w:rFonts w:ascii="Cascadia Mono" w:hAnsi="Cascadia Mono"/>
         </w:rPr>
-        <w:t>Continue</w:t>
-      </w:r>
-      <w:r>
-        <w:rPr>
-          <w:rFonts w:ascii="Cascadia Mono" w:hAnsi="Cascadia Mono"/>
-        </w:rPr>
-        <w:t xml:space="preserve"> </w:t>
-      </w:r>
-      <w:r>
-        <w:rPr>
-          <w:rFonts w:ascii="Cascadia Mono" w:hAnsi="Cascadia Mono"/>
-        </w:rPr>
-        <w:t xml:space="preserve">and refine </w:t>
-      </w:r>
-      <w:r>
-        <w:rPr>
-          <w:rFonts w:ascii="Cascadia Mono" w:hAnsi="Cascadia Mono"/>
-        </w:rPr>
-        <w:t>Figma design process</w:t>
-      </w:r>
-    </w:p>
-    <w:p>
-      <w:pPr>
-        <w:numPr>
-          <w:ilvl w:val="0"/>
-          <w:numId w:val="5"/>
-        </w:numPr>
-        <w:rPr>
-          <w:rFonts w:ascii="Cascadia Mono" w:hAnsi="Cascadia Mono"/>
-        </w:rPr>
-      </w:pPr>
-      <w:r>
-        <w:rPr>
-          <w:rFonts w:ascii="Cascadia Mono" w:hAnsi="Cascadia Mono"/>
-        </w:rPr>
-        <w:t xml:space="preserve">Complete IKS </w:t>
-      </w:r>
-      <w:r>
-        <w:rPr>
-          <w:rFonts w:ascii="Cascadia Mono" w:hAnsi="Cascadia Mono"/>
-        </w:rPr>
-        <w:t>checkpoint</w:t>
-      </w:r>
-      <w:r>
-        <w:rPr>
-          <w:rFonts w:ascii="Cascadia Mono" w:hAnsi="Cascadia Mono"/>
-        </w:rPr>
-        <w:t xml:space="preserve"> tasks (2.3, 2.2.1, 2.2.2, navigation menu)</w:t>
-      </w:r>
-    </w:p>
-    <w:p>
-      <w:pPr>
-        <w:numPr>
-          <w:ilvl w:val="0"/>
-          <w:numId w:val="5"/>
-        </w:numPr>
-        <w:rPr>
-          <w:rFonts w:ascii="Cascadia Mono" w:hAnsi="Cascadia Mono"/>
-        </w:rPr>
-      </w:pPr>
-      <w:r>
-        <w:rPr>
-          <w:rFonts w:ascii="Cascadia Mono" w:hAnsi="Cascadia Mono"/>
-        </w:rPr>
-        <w:t>Finalize</w:t>
-      </w:r>
-      <w:r>
-        <w:rPr>
-          <w:rFonts w:ascii="Cascadia Mono" w:hAnsi="Cascadia Mono"/>
-        </w:rPr>
-        <w:t xml:space="preserve"> a detailed plan for completing requirements of other courses for their first checkpoints</w:t>
+        <w:t>Initialize and connect the Mobile Application project to GitHub.</w:t>
       </w:r>
     </w:p>
     <w:p>
@@ -464,13 +372,7 @@
         <w:rPr>
           <w:rFonts w:ascii="Cascadia Mono" w:hAnsi="Cascadia Mono"/>
         </w:rPr>
-        <w:t xml:space="preserve">Project was connected to Git, </w:t>
-      </w:r>
-      <w:r>
-        <w:rPr>
-          <w:rFonts w:ascii="Cascadia Mono" w:hAnsi="Cascadia Mono"/>
-        </w:rPr>
-        <w:t>previously developed code migrated into the repository.</w:t>
+        <w:t>Complete all required tasks for ISS Checkpoint 1.</w:t>
       </w:r>
     </w:p>
     <w:p>
@@ -487,119 +389,15 @@
         <w:rPr>
           <w:rFonts w:ascii="Cascadia Mono" w:hAnsi="Cascadia Mono"/>
         </w:rPr>
-        <w:t>Core</w:t>
-      </w:r>
-      <w:r>
-        <w:rPr>
-          <w:rFonts w:ascii="Cascadia Mono" w:hAnsi="Cascadia Mono"/>
-        </w:rPr>
-        <w:t xml:space="preserve"> domains created</w:t>
-      </w:r>
-      <w:r>
-        <w:rPr>
-          <w:rFonts w:ascii="Cascadia Mono" w:hAnsi="Cascadia Mono"/>
-        </w:rPr>
-        <w:t xml:space="preserve"> and organized</w:t>
-      </w:r>
-      <w:r>
-        <w:rPr>
-          <w:rFonts w:ascii="Cascadia Mono" w:hAnsi="Cascadia Mono"/>
-        </w:rPr>
-        <w:t>.</w:t>
+        <w:t>Improve and update the Trello board, including linking relevant Git commits.</w:t>
       </w:r>
     </w:p>
     <w:p>
       <w:pPr>
-        <w:numPr>
-          <w:ilvl w:val="0"/>
-          <w:numId w:val="2"/>
-        </w:numPr>
-        <w:rPr>
-          <w:rFonts w:ascii="Cascadia Mono" w:hAnsi="Cascadia Mono"/>
-        </w:rPr>
-      </w:pPr>
-      <w:r>
-        <w:rPr>
-          <w:rFonts w:ascii="Cascadia Mono" w:hAnsi="Cascadia Mono"/>
-        </w:rPr>
-        <w:t>Further progress m</w:t>
-      </w:r>
-      <w:r>
-        <w:rPr>
-          <w:rFonts w:ascii="Cascadia Mono" w:hAnsi="Cascadia Mono"/>
-        </w:rPr>
-        <w:t>ade in Figma.</w:t>
-      </w:r>
-    </w:p>
-    <w:p>
-      <w:pPr>
-        <w:numPr>
-          <w:ilvl w:val="0"/>
-          <w:numId w:val="2"/>
-        </w:numPr>
-        <w:rPr>
-          <w:rFonts w:ascii="Cascadia Mono" w:hAnsi="Cascadia Mono"/>
-        </w:rPr>
-      </w:pPr>
-      <w:r>
-        <w:rPr>
-          <w:rFonts w:ascii="Cascadia Mono" w:hAnsi="Cascadia Mono"/>
-        </w:rPr>
-        <w:t xml:space="preserve">IKS checkpoints completed, </w:t>
-      </w:r>
-      <w:r>
-        <w:rPr>
-          <w:rFonts w:ascii="Cascadia Mono" w:hAnsi="Cascadia Mono"/>
-        </w:rPr>
-        <w:t>pending</w:t>
-      </w:r>
-      <w:r>
-        <w:rPr>
-          <w:rFonts w:ascii="Cascadia Mono" w:hAnsi="Cascadia Mono"/>
-        </w:rPr>
-        <w:t xml:space="preserve"> test</w:t>
-      </w:r>
-      <w:r>
-        <w:rPr>
-          <w:rFonts w:ascii="Cascadia Mono" w:hAnsi="Cascadia Mono"/>
-        </w:rPr>
-        <w:t>ing</w:t>
-      </w:r>
-      <w:r>
-        <w:rPr>
-          <w:rFonts w:ascii="Cascadia Mono" w:hAnsi="Cascadia Mono"/>
-        </w:rPr>
-        <w:t>.</w:t>
-      </w:r>
-    </w:p>
-    <w:p>
-      <w:pPr>
-        <w:numPr>
-          <w:ilvl w:val="0"/>
-          <w:numId w:val="2"/>
-        </w:numPr>
-        <w:rPr>
-          <w:rFonts w:ascii="Cascadia Mono" w:hAnsi="Cascadia Mono"/>
-        </w:rPr>
-      </w:pPr>
-      <w:r>
-        <w:rPr>
-          <w:rFonts w:ascii="Cascadia Mono" w:hAnsi="Cascadia Mono"/>
-        </w:rPr>
-        <w:t>Rough plan for ISS checkpoint</w:t>
-      </w:r>
-      <w:r>
-        <w:rPr>
-          <w:rFonts w:ascii="Cascadia Mono" w:hAnsi="Cascadia Mono"/>
-        </w:rPr>
-        <w:t xml:space="preserve"> prepared</w:t>
-      </w:r>
-      <w:r>
-        <w:rPr>
-          <w:rFonts w:ascii="Cascadia Mono" w:hAnsi="Cascadia Mono"/>
-        </w:rPr>
-        <w:t xml:space="preserve">. </w:t>
-      </w:r>
+        <w:rPr>
+          <w:rFonts w:ascii="Cascadia Mono" w:hAnsi="Cascadia Mono"/>
+        </w:rPr>
+      </w:pPr>
       <w:r>
         <w:rPr>
           <w:rFonts w:ascii="Cascadia Mono" w:hAnsi="Cascadia Mono"/>
@@ -638,24 +436,7 @@
         <w:rPr>
           <w:rFonts w:ascii="Cascadia Mono" w:hAnsi="Cascadia Mono"/>
         </w:rPr>
-        <w:t>Spring Boot build issues occurred multiple times during the sprint, but were ultimately resolved and the application is now functional.</w:t>
-      </w:r>
-    </w:p>
-    <w:p>
-      <w:pPr>
-        <w:numPr>
-          <w:ilvl w:val="0"/>
-          <w:numId w:val="3"/>
-        </w:numPr>
-        <w:rPr>
-          <w:rFonts w:ascii="Cascadia Mono" w:hAnsi="Cascadia Mono"/>
-        </w:rPr>
-      </w:pPr>
-      <w:r>
-        <w:rPr>
-          <w:rFonts w:ascii="Cascadia Mono" w:hAnsi="Cascadia Mono"/>
-        </w:rPr>
-        <w:t>The Angular project setup encountered configuration issues and had to be recreated.</w:t>
+        <w:t>Nothing.</w:t>
       </w:r>
       <w:r>
         <w:rPr>
@@ -707,11 +488,18 @@
         <w:rPr>
           <w:rFonts w:ascii="Cascadia Mono" w:hAnsi="Cascadia Mono"/>
         </w:rPr>
-        <w:t>Clearer and more consistent Git commit messages.</w:t>
+        <w:t>C</w:t>
+      </w:r>
+      <w:r>
+        <w:rPr>
+          <w:rFonts w:ascii="Cascadia Mono" w:hAnsi="Cascadia Mono"/>
+        </w:rPr>
+        <w:t>leaner variable names.</w:t>
       </w:r>
     </w:p>
     <w:p>
       <w:pPr>
+        <w:pStyle w:val="ListParagraph"/>
         <w:numPr>
           <w:ilvl w:val="0"/>
           <w:numId w:val="4"/>
@@ -724,37 +512,11 @@
         <w:rPr>
           <w:rFonts w:ascii="Cascadia Mono" w:hAnsi="Cascadia Mono"/>
         </w:rPr>
-        <w:t>More structured and detailed User Stories on the Trello board.</w:t>
-      </w:r>
-    </w:p>
-    <w:p>
-      <w:pPr>
-        <w:numPr>
-          <w:ilvl w:val="0"/>
-          <w:numId w:val="4"/>
-        </w:numPr>
-        <w:rPr>
-          <w:rFonts w:ascii="Cascadia Mono" w:hAnsi="Cascadia Mono"/>
-        </w:rPr>
-      </w:pPr>
-      <w:r>
-        <w:rPr>
-          <w:rFonts w:ascii="Cascadia Mono" w:hAnsi="Cascadia Mono"/>
-        </w:rPr>
-        <w:t>Better consistency in naming conventions for files, classes, and variables to reduce the need for later fixe</w:t>
-      </w:r>
-      <w:r>
-        <w:rPr>
-          <w:rFonts w:ascii="Cascadia Mono" w:hAnsi="Cascadia Mono"/>
-        </w:rPr>
-        <w:t>s.</w:t>
-      </w:r>
-      <w:r>
-        <w:rPr>
-          <w:rFonts w:ascii="Cascadia Mono" w:hAnsi="Cascadia Mono"/>
-        </w:rPr>
+        <w:t xml:space="preserve">Completing whole goal list. </w:t>
+      </w:r>
+      <w:r>
         <w:pict>
-          <v:rect id="_x0000_i1035" style="width:426.8pt;height:1pt" o:hrpct="988" o:hralign="center" o:hrstd="t" o:hr="t" fillcolor="#a0a0a0" stroked="f"/>
+          <v:rect id="_x0000_i1029" style="width:426.8pt;height:1pt" o:hrpct="988" o:hralign="center" o:hrstd="t" o:hr="t" fillcolor="#a0a0a0" stroked="f"/>
         </w:pict>
       </w:r>
     </w:p>
@@ -789,42 +551,16 @@
         <w:rPr>
           <w:rFonts w:ascii="Cascadia Mono" w:hAnsi="Cascadia Mono"/>
         </w:rPr>
-        <w:t>Complete all required tasks for ISS Checkpoint 1.</w:t>
+        <w:t>The Break for holidays</w:t>
       </w:r>
     </w:p>
     <w:p>
       <w:pPr>
-        <w:numPr>
-          <w:ilvl w:val="0"/>
-          <w:numId w:val="5"/>
-        </w:numPr>
-        <w:rPr>
-          <w:rFonts w:ascii="Cascadia Mono" w:hAnsi="Cascadia Mono"/>
-        </w:rPr>
-      </w:pPr>
-      <w:r>
-        <w:rPr>
-          <w:rFonts w:ascii="Cascadia Mono" w:hAnsi="Cascadia Mono"/>
-        </w:rPr>
-        <w:t>Improve and update the Trello board, including linking relevant Git commits.</w:t>
-      </w:r>
-    </w:p>
-    <w:p>
-      <w:pPr>
-        <w:numPr>
-          <w:ilvl w:val="0"/>
-          <w:numId w:val="5"/>
-        </w:numPr>
-        <w:rPr>
-          <w:rFonts w:ascii="Cascadia Mono" w:hAnsi="Cascadia Mono"/>
-        </w:rPr>
-      </w:pPr>
-      <w:r>
-        <w:rPr>
-          <w:rFonts w:ascii="Cascadia Mono" w:hAnsi="Cascadia Mono"/>
-        </w:rPr>
-        <w:t>Initialize and connect the Mobile Application project to GitHub.</w:t>
-      </w:r>
+        <w:ind w:left="720"/>
+        <w:rPr>
+          <w:rFonts w:ascii="Cascadia Mono" w:hAnsi="Cascadia Mono"/>
+        </w:rPr>
+      </w:pPr>
     </w:p>
     <w:sectPr>
       <w:pgSz w:w="12240" w:h="15840"/>
@@ -2001,7 +1737,7 @@
   <w:style w:type="paragraph" w:default="1" w:styleId="Normal">
     <w:name w:val="Normal"/>
     <w:qFormat/>
-    <w:rsid w:val="009210E9"/>
+    <w:rsid w:val="00B87B8E"/>
   </w:style>
   <w:style w:type="paragraph" w:styleId="Heading1">
     <w:name w:val="heading 1"/>
@@ -2205,6 +1941,7 @@
   <w:style w:type="character" w:default="1" w:styleId="DefaultParagraphFont">
     <w:name w:val="Default Paragraph Font"/>
     <w:uiPriority w:val="1"/>
+    <w:semiHidden/>
     <w:unhideWhenUsed/>
   </w:style>
   <w:style w:type="table" w:default="1" w:styleId="TableNormal">

</xml_diff>